<commit_message>
Cho phep nhap du lieu tu ban phim cho tat ca bai tap Lab 2
</commit_message>
<xml_diff>
--- a/24002545_PhanVanThang_Lab2.docx
+++ b/24002545_PhanVanThang_Lab2.docx
@@ -91,152 +91,78 @@
           <w:rFonts w:cs="Times New Roman"/>
           <w:color w:val="auto"/>
         </w:rPr>
-        <w:t xml:space="preserve">- </w:t>
+        <w:t xml:space="preserve">Solution Visual Studio: IT3212_Labs.sln </w:t>
+      </w:r>
+    </w:p>
+    <w:p>
+      <w:pPr>
+        <w:spacing w:after="120" w:line="360" w:lineRule="auto"/>
+        <w:rPr>
+          <w:rFonts w:cs="Times New Roman"/>
+          <w:color w:val="auto"/>
+        </w:rPr>
+      </w:pPr>
+      <w:r>
+        <w:rPr>
+          <w:rFonts w:cs="Times New Roman"/>
+          <w:color w:val="auto"/>
+        </w:rPr>
+        <w:t xml:space="preserve">Project C# Console: lab2/Lab02_OOPBasics.csproj </w:t>
+      </w:r>
+    </w:p>
+    <w:p>
+      <w:pPr>
+        <w:spacing w:after="120" w:line="360" w:lineRule="auto"/>
+        <w:rPr>
+          <w:rFonts w:cs="Times New Roman"/>
+          <w:color w:val="auto"/>
+        </w:rPr>
+      </w:pPr>
+      <w:r>
+        <w:rPr>
+          <w:rFonts w:cs="Times New Roman"/>
+          <w:color w:val="auto"/>
+        </w:rPr>
+        <w:t xml:space="preserve">Các lớp đối tượng: SinhVien.cs, SanPham.cs, TaiKhoanNganHang.cs, NhanVien.cs, HinhChuNhat.cs </w:t>
+      </w:r>
+    </w:p>
+    <w:p>
+      <w:pPr>
+        <w:spacing w:after="120" w:line="360" w:lineRule="auto"/>
+        <w:rPr>
+          <w:rFonts w:cs="Times New Roman"/>
+          <w:color w:val="auto"/>
+        </w:rPr>
+      </w:pPr>
+      <w:r>
+        <w:rPr>
+          <w:rFonts w:cs="Times New Roman"/>
+          <w:color w:val="auto"/>
+        </w:rPr>
+        <w:t xml:space="preserve">Mã nguồn chương trình chính: lab2/Program.cs </w:t>
+      </w:r>
+    </w:p>
+    <w:p>
+      <w:pPr>
+        <w:spacing w:after="120" w:line="360" w:lineRule="auto"/>
+        <w:rPr>
+          <w:rFonts w:cs="Times New Roman"/>
+          <w:color w:val="auto"/>
+        </w:rPr>
+      </w:pPr>
+      <w:r>
+        <w:rPr>
+          <w:rFonts w:cs="Times New Roman"/>
+          <w:color w:val="auto"/>
+        </w:rPr>
+        <w:t>Lệnh chạy: trong visual studio bấm F5 để chạy hoặc lệnh cmd cd lab2 dotnet run --project lab2/Lab02_OOPBasics.csproj</w:t>
       </w:r>
       <w:r>
         <w:rPr>
           <w:rFonts w:cs="Times New Roman"/>
           <w:color w:val="auto"/>
         </w:rPr>
-        <w:t>Solution Visual Studio: lab2/IT3212_Labs.sln</w:t>
-      </w:r>
-      <w:r>
-        <w:rPr>
-          <w:rFonts w:cs="Times New Roman"/>
-          <w:color w:val="auto"/>
-        </w:rPr>
-        <w:br/>
-      </w:r>
-      <w:r>
-        <w:rPr>
-          <w:rFonts w:cs="Times New Roman"/>
-          <w:color w:val="auto"/>
-        </w:rPr>
-        <w:t xml:space="preserve">- </w:t>
-      </w:r>
-      <w:r>
-        <w:rPr>
-          <w:rFonts w:cs="Times New Roman"/>
-          <w:color w:val="auto"/>
-        </w:rPr>
-        <w:t>Project C# Console: lab2/Lab02_OOPBasics/Lab02_OOPBasics.csproj</w:t>
-      </w:r>
-      <w:r>
-        <w:rPr>
-          <w:rFonts w:cs="Times New Roman"/>
-          <w:color w:val="auto"/>
-        </w:rPr>
-        <w:br/>
-      </w:r>
-      <w:r>
-        <w:rPr>
-          <w:rFonts w:cs="Times New Roman"/>
-          <w:color w:val="auto"/>
-        </w:rPr>
-        <w:t xml:space="preserve">- </w:t>
-      </w:r>
-      <w:r>
-        <w:rPr>
-          <w:rFonts w:cs="Times New Roman"/>
-          <w:color w:val="auto"/>
-        </w:rPr>
-        <w:t>Các lớp đối tượng: SinhVien.cs, SanPham.cs, TaiKhoanNganHang.cs, NhanVien.cs, HinhChuNhat.cs</w:t>
-      </w:r>
-      <w:r>
-        <w:rPr>
-          <w:rFonts w:cs="Times New Roman"/>
-          <w:color w:val="auto"/>
-        </w:rPr>
-        <w:br/>
-      </w:r>
-      <w:r>
-        <w:rPr>
-          <w:rFonts w:cs="Times New Roman"/>
-          <w:color w:val="auto"/>
-        </w:rPr>
-        <w:t xml:space="preserve">- </w:t>
-      </w:r>
-      <w:r>
-        <w:rPr>
-          <w:rFonts w:cs="Times New Roman"/>
-          <w:color w:val="auto"/>
-        </w:rPr>
-        <w:t>Mã nguồn chương trình chính: lab2/Lab02_OOPBasics/Program.cs</w:t>
-      </w:r>
-      <w:r>
-        <w:rPr>
-          <w:rFonts w:cs="Times New Roman"/>
-          <w:b/>
-          <w:color w:val="auto"/>
-        </w:rPr>
-        <w:br/>
-      </w:r>
-      <w:r>
-        <w:rPr>
-          <w:rFonts w:cs="Times New Roman"/>
-          <w:color w:val="auto"/>
-        </w:rPr>
-        <w:t xml:space="preserve">- </w:t>
-      </w:r>
-      <w:r>
-        <w:rPr>
-          <w:rFonts w:cs="Times New Roman"/>
-          <w:color w:val="auto"/>
-        </w:rPr>
-        <w:t>Lệnh chạy</w:t>
-      </w:r>
-      <w:r>
-        <w:rPr>
-          <w:rFonts w:cs="Times New Roman"/>
-          <w:color w:val="auto"/>
-        </w:rPr>
-        <w:t>: trong visual studio bấm F5 để chạy hoặc lệnh cmd</w:t>
-      </w:r>
-    </w:p>
-    <w:p>
-      <w:pPr>
-        <w:spacing w:after="120" w:line="360" w:lineRule="auto"/>
-        <w:rPr>
-          <w:rFonts w:cs="Times New Roman"/>
-          <w:bCs/>
-          <w:color w:val="auto"/>
-        </w:rPr>
-      </w:pPr>
-      <w:r>
-        <w:rPr>
-          <w:rFonts w:cs="Times New Roman"/>
-          <w:bCs/>
-          <w:color w:val="auto"/>
-          <w:sz w:val="21"/>
-        </w:rPr>
-        <w:t xml:space="preserve">   cd lab2</w:t>
-      </w:r>
-      <w:r>
-        <w:rPr>
-          <w:rFonts w:cs="Times New Roman"/>
-          <w:bCs/>
-          <w:color w:val="auto"/>
-          <w:sz w:val="21"/>
-        </w:rPr>
-        <w:br/>
-        <w:t xml:space="preserve">   dotnet run --project Lab02_OOPBasics/Lab02_OOPBasics.csproj</w:t>
-      </w:r>
-    </w:p>
-    <w:p>
-      <w:pPr>
-        <w:pStyle w:val="Heading1"/>
-        <w:spacing w:before="0" w:after="120" w:line="360" w:lineRule="auto"/>
-        <w:rPr>
-          <w:rFonts w:ascii="Times New Roman" w:hAnsi="Times New Roman" w:cs="Times New Roman"/>
-          <w:color w:val="auto"/>
-        </w:rPr>
-      </w:pPr>
-      <w:r>
-        <w:rPr>
-          <w:rFonts w:ascii="Times New Roman" w:hAnsi="Times New Roman" w:cs="Times New Roman"/>
-          <w:color w:val="auto"/>
-        </w:rPr>
-        <w:t>II. CHI TIẾT KẾT QUẢ THỰC HIỆN VÀ ẢNH CHỤP CMD</w:t>
+        <w:t xml:space="preserve">II. </w:t>
       </w:r>
     </w:p>
     <w:p>
@@ -2421,7 +2347,6 @@
   <w:style w:type="character" w:default="1" w:styleId="DefaultParagraphFont">
     <w:name w:val="Default Paragraph Font"/>
     <w:uiPriority w:val="1"/>
-    <w:semiHidden/>
     <w:unhideWhenUsed/>
   </w:style>
   <w:style w:type="table" w:default="1" w:styleId="TableNormal">

</xml_diff>